<commit_message>
feat(admin): add in-app help and contextual guidance
</commit_message>
<xml_diff>
--- a/handoff/client-admin-guide/Chef-Rahs-Twisted-Kitchen-Admin-Handbook-v1.0.docx
+++ b/handoff/client-admin-guide/Chef-Rahs-Twisted-Kitchen-Admin-Handbook-v1.0.docx
@@ -1215,6 +1215,62 @@
           <w:sz w:val="22"/>
         </w:rPr>
         <w:t>The dashboard summarizes work that needs attention. Counts are cues to investigate, not substitutes for opening the underlying record.</w:t>
+      </w:r>
+    </w:p>
+    <w:p>
+      <w:pPr>
+        <w:pStyle w:val="Heading2"/>
+      </w:pPr>
+      <w:r>
+        <w:t>Getting Help Inside the Admin Dashboard</w:t>
+      </w:r>
+    </w:p>
+    <w:p>
+      <w:pPr>
+        <w:pStyle w:val="ListBullet"/>
+      </w:pPr>
+      <w:r>
+        <w:t>Open Help &amp; Guide from the Admin Dashboard for searchable instructions.</w:t>
+      </w:r>
+    </w:p>
+    <w:p>
+      <w:pPr>
+        <w:pStyle w:val="ListBullet"/>
+      </w:pPr>
+      <w:r>
+        <w:t>Use Help with this page to open guidance without losing unfinished work.</w:t>
+      </w:r>
+    </w:p>
+    <w:p>
+      <w:pPr>
+        <w:pStyle w:val="ListBullet"/>
+      </w:pPr>
+      <w:r>
+        <w:t>Use question-mark buttons for short explanations beside selected controls.</w:t>
+      </w:r>
+    </w:p>
+    <w:p>
+      <w:pPr>
+        <w:pStyle w:val="ListBullet"/>
+      </w:pPr>
+      <w:r>
+        <w:t>Read visible warnings before financial or permanent actions.</w:t>
+      </w:r>
+    </w:p>
+    <w:p>
+      <w:pPr>
+        <w:pStyle w:val="ListBullet"/>
+      </w:pPr>
+      <w:r>
+        <w:t>Open or download the full handbook and daily quick reference from Help &amp; Guide.</w:t>
+      </w:r>
+    </w:p>
+    <w:p>
+      <w:pPr>
+        <w:pStyle w:val="ListBullet"/>
+      </w:pPr>
+      <w:r>
+        <w:t>For additional help, contact Recon Dev LLC through your usual support channel.</w:t>
       </w:r>
     </w:p>
     <w:p>

</xml_diff>